<commit_message>
Fix history rename keys and preserve recording dates
</commit_message>
<xml_diff>
--- a/docs/GZWHISPER_PRODUCT_FUNCTIONALITY_RU.docx
+++ b/docs/GZWHISPER_PRODUCT_FUNCTIONALITY_RU.docx
@@ -102,7 +102,7 @@
           <w:color w:val="5D6875"/>
           <w:sz w:val="21"/>
         </w:rPr>
-        <w:t>Версия исходников: v1.5.3, build 270827</w:t>
+        <w:t>Версия исходников: v1.5.4, build 270828</w:t>
       </w:r>
     </w:p>
     <w:p>
@@ -3669,7 +3669,7 @@
         <w:rPr>
           <w:rFonts w:ascii="Calibri" w:hAnsi="Calibri" w:eastAsia="Calibri"/>
         </w:rPr>
-        <w:t>дату создания или завершения;</w:t>
+        <w:t>дату оригинальной записи и отдельную дату завершения транскрипции;</w:t>
       </w:r>
     </w:p>
     <w:p>
@@ -4026,7 +4026,7 @@
         <w:rPr>
           <w:rFonts w:ascii="Calibri" w:hAnsi="Calibri" w:eastAsia="Calibri"/>
         </w:rPr>
-        <w:t>Можно подтвердить Enter/галочкой или отменить.</w:t>
+        <w:t>Можно вводить названия с пробелами, подтвердить Enter/галочкой или отменить Escape/крестиком.</w:t>
       </w:r>
     </w:p>
     <w:p>
@@ -4266,6 +4266,14 @@
           <w:rFonts w:ascii="Calibri" w:hAnsi="Calibri" w:eastAsia="Calibri"/>
         </w:rPr>
         <w:t>Кнопки быстрых действий появляются при наведении или фокусе с клавиатуры, чтобы история оставалась компактной. Строка открывается клавишами Return и Space, действия доступны VoiceOver. Добавление медиа и поиск истории имеют сочетания ⌘O и ⌘F.</w:t>
+      </w:r>
+    </w:p>
+    <w:p>
+      <w:r>
+        <w:rPr>
+          <w:rFonts w:ascii="Calibri" w:hAnsi="Calibri" w:eastAsia="Calibri"/>
+        </w:rPr>
+        <w:t>Основная дата в строке истории — время исходной записи. Для записей приложения оно восстанавливается из временной метки имени файла, для импортированных файлов берётся доступная дата создания/изменения медиа. Когда исходная дата недоступна, используется прежняя дата элемента истории. Меню в заголовке истории переключает сортировку между датой записи (по умолчанию) и датой транскрипции. Активная очередь всегда остаётся сверху.</w:t>
       </w:r>
     </w:p>
     <w:p>
@@ -7226,7 +7234,7 @@
         <w:color w:val="5D6875"/>
         <w:sz w:val="18"/>
       </w:rPr>
-      <w:t>v1.5.3 · состояние 23.09.2026</w:t>
+      <w:t>v1.5.4 · состояние 23.09.2026</w:t>
     </w:r>
     <w:r>
       <w:tab/>

</xml_diff>

<commit_message>
Release GZ Whisper Legacy 1.5.5 in maintenance mode
</commit_message>
<xml_diff>
--- a/docs/GZWHISPER_PRODUCT_FUNCTIONALITY_RU.docx
+++ b/docs/GZWHISPER_PRODUCT_FUNCTIONALITY_RU.docx
@@ -28,7 +28,7 @@
         <w:jc w:val="center"/>
       </w:pPr>
       <w:r>
-        <w:t>GZWhisper</w:t>
+        <w:t>GZ Whisper Legacy</w:t>
       </w:r>
     </w:p>
     <w:p>
@@ -54,7 +54,7 @@
         </w:rPr>
         <w:t>Контекст для глубокого исследования конкурентов</w:t>
         <w:br/>
-        <w:t>и поиска функций для продуктового развития</w:t>
+        <w:t>и справочный материал для нового GZ Whisper</w:t>
       </w:r>
     </w:p>
     <w:p>
@@ -88,7 +88,7 @@
           <w:color w:val="5D6875"/>
           <w:sz w:val="21"/>
         </w:rPr>
-        <w:t>Снимок продукта: 23 сентября 2026 года</w:t>
+        <w:t>Снимок продукта: 10 октября 2026 года</w:t>
       </w:r>
     </w:p>
     <w:p>
@@ -102,7 +102,7 @@
           <w:color w:val="5D6875"/>
           <w:sz w:val="21"/>
         </w:rPr>
-        <w:t>Версия исходников: v1.5.4, build 270828</w:t>
+        <w:t>Опубликованная версия macOS: v1.5.5, build 270829</w:t>
       </w:r>
     </w:p>
     <w:p>
@@ -116,7 +116,7 @@
           <w:color w:val="5D6875"/>
           <w:sz w:val="21"/>
         </w:rPr>
-        <w:t>Учтено актуальное состояние рабочего дерева, включая улучшения сохранения, истории и доступности</w:t>
+        <w:t>Legacy: новые функции заморожены; поддержка — исправление ошибок пользователей</w:t>
       </w:r>
     </w:p>
     <w:p>
@@ -390,7 +390,7 @@
         <w:rPr>
           <w:rFonts w:ascii="Calibri" w:hAnsi="Calibri" w:eastAsia="Calibri"/>
         </w:rPr>
-        <w:t>Этот документ описывает фактически реализованный функционал GZWhisper. Его можно целиком передать в ChatGPT Pro или другому исследовательскому агенту как исходный контекст для:</w:t>
+        <w:t>Этот документ описывает фактически реализованный функционал GZ Whisper Legacy. Его можно целиком передать в ChatGPT Pro или другому исследовательскому агенту как исходный контекст для:</w:t>
       </w:r>
     </w:p>
     <w:p>
@@ -435,7 +435,7 @@
         <w:rPr>
           <w:rFonts w:ascii="Calibri" w:hAnsi="Calibri" w:eastAsia="Calibri"/>
         </w:rPr>
-        <w:t>выявления функций, которых сейчас нет в GZWhisper, но которые стоит рассмотреть;</w:t>
+        <w:t>выявления функций, которых сейчас нет в GZ Whisper Legacy, но которые стоит рассмотреть;</w:t>
       </w:r>
     </w:p>
     <w:p>
@@ -494,7 +494,7 @@
         <w:rPr>
           <w:rFonts w:ascii="Calibri" w:hAnsi="Calibri" w:eastAsia="Calibri"/>
         </w:rPr>
-        <w:t>GZWhisper — локальное настольное приложение для транскрибации аудио и видео. После загрузки модели распознавание выполняется на компьютере пользователя. Основная и наиболее развитая версия — нативное приложение для macOS на SwiftUI. Также существуют упрощённые варианты для Linux и Windows, построенные на Python/Tkinter; Windows-вариант распространяется как portable-приложение.</w:t>
+        <w:t>GZ Whisper Legacy — локальное настольное приложение для транскрибации аудио и видео. После загрузки модели распознавание выполняется на компьютере пользователя. Основная и наиболее развитая версия — нативное приложение для macOS на SwiftUI. Также существуют упрощённые варианты для Linux и Windows, построенные на Python/Tkinter; Windows-вариант распространяется как portable-приложение.</w:t>
       </w:r>
     </w:p>
     <w:p>
@@ -562,7 +562,7 @@
         <w:rPr>
           <w:rFonts w:ascii="Calibri" w:hAnsi="Calibri" w:eastAsia="Calibri"/>
         </w:rPr>
-        <w:t>Работать с локальной историей записей и транскриптов: искать, переименовывать, открывать, повторно ставить в очередь, находить файлы в Finder и удалять с возможностью отмены.</w:t>
+        <w:t>Работать с локальной историей записей и транскриптов: искать, переименовывать, открывать, повторно ставить в очередь, находить файлы в Finder и удалять с возможностью отмены. В сборке 1.5.5 готовый результат можно перетранскрибировать в отдельную запись.</w:t>
       </w:r>
     </w:p>
     <w:p>
@@ -770,7 +770,7 @@
           <w:sz w:val="21"/>
           <w:shd w:fill="EDF1F5"/>
         </w:rPr>
-        <w:t>GZWhisper.app</w:t>
+        <w:t>GZ Whisper Legacy.app</w:t>
       </w:r>
       <w:r>
         <w:rPr>
@@ -892,7 +892,7 @@
           <w:color w:val="2E74B5"/>
           <w:sz w:val="26"/>
         </w:rPr>
-        <w:t>3.3. Windows — portable-версия в разработке</w:t>
+        <w:t>3.3. Windows — экспериментальная portable-версия</w:t>
       </w:r>
     </w:p>
     <w:p>
@@ -4137,7 +4137,7 @@
         <w:rPr>
           <w:rFonts w:ascii="Calibri" w:hAnsi="Calibri" w:eastAsia="Calibri"/>
         </w:rPr>
-        <w:t>поставить подходящий элемент в очередь;</w:t>
+        <w:t>в текущем рабочем дереве повторно транскрибировать готовый элемент с созданием отдельного результата; исходный текст и ручные правки сохраняются;</w:t>
       </w:r>
     </w:p>
     <w:p>
@@ -4152,7 +4152,7 @@
         <w:rPr>
           <w:rFonts w:ascii="Calibri" w:hAnsi="Calibri" w:eastAsia="Calibri"/>
         </w:rPr>
-        <w:t>запустить queued-элемент немедленно;</w:t>
+        <w:t>поставить подходящий элемент в очередь;</w:t>
       </w:r>
     </w:p>
     <w:p>
@@ -4167,7 +4167,7 @@
         <w:rPr>
           <w:rFonts w:ascii="Calibri" w:hAnsi="Calibri" w:eastAsia="Calibri"/>
         </w:rPr>
-        <w:t>выбрать несколько элементов для запуска;</w:t>
+        <w:t>запустить queued-элемент немедленно;</w:t>
       </w:r>
     </w:p>
     <w:p>
@@ -4182,7 +4182,7 @@
         <w:rPr>
           <w:rFonts w:ascii="Calibri" w:hAnsi="Calibri" w:eastAsia="Calibri"/>
         </w:rPr>
-        <w:t>менять позицию queued-элемента;</w:t>
+        <w:t>выбрать несколько элементов для запуска;</w:t>
       </w:r>
     </w:p>
     <w:p>
@@ -4197,7 +4197,7 @@
         <w:rPr>
           <w:rFonts w:ascii="Calibri" w:hAnsi="Calibri" w:eastAsia="Calibri"/>
         </w:rPr>
-        <w:t>убрать его из очереди;</w:t>
+        <w:t>менять позицию queued-элемента;</w:t>
       </w:r>
     </w:p>
     <w:p>
@@ -4212,7 +4212,7 @@
         <w:rPr>
           <w:rFonts w:ascii="Calibri" w:hAnsi="Calibri" w:eastAsia="Calibri"/>
         </w:rPr>
-        <w:t>показать TXT в Finder;</w:t>
+        <w:t>убрать его из очереди;</w:t>
       </w:r>
     </w:p>
     <w:p>
@@ -4227,7 +4227,7 @@
         <w:rPr>
           <w:rFonts w:ascii="Calibri" w:hAnsi="Calibri" w:eastAsia="Calibri"/>
         </w:rPr>
-        <w:t>показать записанное аудио в Finder;</w:t>
+        <w:t>показать TXT в Finder;</w:t>
       </w:r>
     </w:p>
     <w:p>
@@ -4242,7 +4242,7 @@
         <w:rPr>
           <w:rFonts w:ascii="Calibri" w:hAnsi="Calibri" w:eastAsia="Calibri"/>
         </w:rPr>
-        <w:t>переименовать элемент;</w:t>
+        <w:t>показать записанное аудио в Finder;</w:t>
       </w:r>
     </w:p>
     <w:p>
@@ -4257,6 +4257,21 @@
         <w:rPr>
           <w:rFonts w:ascii="Calibri" w:hAnsi="Calibri" w:eastAsia="Calibri"/>
         </w:rPr>
+        <w:t>переименовать элемент;</w:t>
+      </w:r>
+    </w:p>
+    <w:p>
+      <w:pPr>
+        <w:numPr>
+          <w:ilvl w:val="0"/>
+          <w:numId w:val="37"/>
+        </w:numPr>
+        <w:spacing w:before="0" w:after="80" w:line="300" w:lineRule="auto"/>
+      </w:pPr>
+      <w:r>
+        <w:rPr>
+          <w:rFonts w:ascii="Calibri" w:hAnsi="Calibri" w:eastAsia="Calibri"/>
+        </w:rPr>
         <w:t>удалить элемент.</w:t>
       </w:r>
     </w:p>
@@ -4423,6 +4438,14 @@
         <w:rPr>
           <w:rFonts w:ascii="Calibri" w:hAnsi="Calibri" w:eastAsia="Calibri"/>
         </w:rPr>
+        <w:t>В текущем рабочем дереве повторные транскрипции одной записи разделяют исходное аудио. Оно остаётся на месте, пока на него ссылается хотя бы один элемент истории.</w:t>
+      </w:r>
+    </w:p>
+    <w:p>
+      <w:r>
+        <w:rPr>
+          <w:rFonts w:ascii="Calibri" w:hAnsi="Calibri" w:eastAsia="Calibri"/>
+        </w:rPr>
         <w:t>Linux/Windows-версия удаляет transcript-файл сразу и не имеет Undo/Trash-поведения. Исходное импортированное медиа там также не удаляется.</w:t>
       </w:r>
     </w:p>
@@ -4469,6 +4492,29 @@
       </w:r>
     </w:p>
     <w:p>
+      <w:r>
+        <w:rPr>
+          <w:rFonts w:ascii="Calibri" w:hAnsi="Calibri" w:eastAsia="Calibri"/>
+        </w:rPr>
+        <w:t xml:space="preserve">В сборке 1.5.5 меню редактора позволяет вставить у курсора маркер новой реплики (⌘⇧M) и настроить его символы; стандартное значение — </w:t>
+      </w:r>
+      <w:r>
+        <w:rPr>
+          <w:rFonts w:ascii="Menlo" w:hAnsi="Menlo" w:eastAsia="Menlo"/>
+          <w:color w:val="1F4D78"/>
+          <w:sz w:val="21"/>
+          <w:shd w:fill="EDF1F5"/>
+        </w:rPr>
+        <w:t xml:space="preserve">- </w:t>
+      </w:r>
+      <w:r>
+        <w:rPr>
+          <w:rFonts w:ascii="Calibri" w:hAnsi="Calibri" w:eastAsia="Calibri"/>
+        </w:rPr>
+        <w:t>. Это ручная разметка: приложение пока не определяет, кто говорит, и не расставляет маркеры автоматически.</w:t>
+      </w:r>
+    </w:p>
+    <w:p>
       <w:pPr>
         <w:pStyle w:val="Heading2"/>
       </w:pPr>
@@ -4486,7 +4532,15 @@
         <w:rPr>
           <w:rFonts w:ascii="Calibri" w:hAnsi="Calibri" w:eastAsia="Calibri"/>
         </w:rPr>
-        <w:t>После успешной транскрибации приложение автоматически сохраняет plain-text-файл в локальной папке транскриптов. Имя строится из безопасной версии basename исходного файла и Unix timestamp. Текст состоит из распознанных сегментов, по одному сегменту на строку, без временных меток.</w:t>
+        <w:t>После успешной транскрибации приложение автоматически сохраняет plain-text-файл в локальной папке транскриптов. Имя строится из безопасной версии basename исходного файла, Unix timestamp и короткого UUID. Текст состоит из распознанных сегментов, по одному сегменту на строку, без временных меток.</w:t>
+      </w:r>
+    </w:p>
+    <w:p>
+      <w:r>
+        <w:rPr>
+          <w:rFonts w:ascii="Calibri" w:hAnsi="Calibri" w:eastAsia="Calibri"/>
+        </w:rPr>
+        <w:t>Короткий UUID защищает исходный результат от перезаписи при повторной транскрибации.</w:t>
       </w:r>
     </w:p>
     <w:p>
@@ -4992,7 +5046,7 @@
         <w:rPr>
           <w:rFonts w:ascii="Calibri" w:hAnsi="Calibri" w:eastAsia="Calibri"/>
         </w:rPr>
-        <w:t>компактной верхней карточки со словом GZWhisper, версией, статусом модели и прогрессом загрузки;</w:t>
+        <w:t>компактной верхней карточки со словом GZ Whisper Legacy, версией, статусом модели и прогрессом загрузки;</w:t>
       </w:r>
     </w:p>
     <w:p>
@@ -5345,6 +5399,14 @@
       </w:r>
     </w:p>
     <w:p>
+      <w:r>
+        <w:rPr>
+          <w:rFonts w:ascii="Calibri" w:hAnsi="Calibri" w:eastAsia="Calibri"/>
+        </w:rPr>
+        <w:t>В текущем рабочем дереве загрузка модели явно показана в интерфейсе, через 45 секунд появляется предупреждение, а через пять минут ожидания worker останавливается с сообщением о повторной загрузке модели или выборе Small/Base. Оставшаяся очередь ставится на паузу.</w:t>
+      </w:r>
+    </w:p>
+    <w:p>
       <w:pPr>
         <w:pStyle w:val="Heading1"/>
       </w:pPr>
@@ -5397,7 +5459,7 @@
         <w:rPr>
           <w:rFonts w:ascii="Calibri" w:hAnsi="Calibri" w:eastAsia="Calibri"/>
         </w:rPr>
-        <w:t>Медиа для транскрибации не отправляется в облачный сервис GZWhisper.</w:t>
+        <w:t>Медиа для транскрибации не отправляется в облачный сервис GZ Whisper Legacy.</w:t>
       </w:r>
     </w:p>
     <w:p>
@@ -6538,15 +6600,22 @@
         <w:rPr>
           <w:rFonts w:ascii="Calibri" w:hAnsi="Calibri" w:eastAsia="Calibri"/>
         </w:rPr>
-        <w:t>8 сентября 2026 года локальный DMG версии 1.5.2 подписан Developer ID Application, прошёл Apple notarization и проверку Gatekeeper. Подтверждения Apple прикреплены к приложению и DMG; обход Gatekeeper для этой сборки не требуется. Ранее опубликованные загрузки автоматически не заменены.</w:t>
-      </w:r>
-    </w:p>
-    <w:p>
-      <w:r>
-        <w:rPr>
-          <w:rFonts w:ascii="Calibri" w:hAnsi="Calibri" w:eastAsia="Calibri"/>
-        </w:rPr>
-        <w:t>11 сентября 2026 года подготовлены отдельные Apple Silicon и Intel DMG версии 1.5.2 для macOS 14–15. Обе сборки получили Developer ID подпись, прошли Apple notarization, stapler validation и Gatekeeper-проверку уже из смонтированных DMG. Для обеих архитектур также проверена чистая офлайн-установка Python-зависимостей и импорт ASR-модулей. Intel-бинарники реально выполнялись как x86_64 под Rosetta; тест на физическом Intel Mac остаётся рекомендуемой финальной проверкой перед массовой публикацией. Артефакты пока не загружены в GitHub Releases.</w:t>
+        <w:t xml:space="preserve">Сборки для публичного распространения подписываются Developer ID Application и заверяются Apple. Для macOS доступны отдельные DMG для Apple Silicon и Intel, а также ZIP для Apple Silicon. Актуальные результаты проверок, идентификаторы заявок и контрольные суммы версии 1.5.5 записаны в </w:t>
+      </w:r>
+      <w:r>
+        <w:rPr>
+          <w:rFonts w:ascii="Menlo" w:hAnsi="Menlo" w:eastAsia="Menlo"/>
+          <w:color w:val="1F4D78"/>
+          <w:sz w:val="21"/>
+          <w:shd w:fill="EDF1F5"/>
+        </w:rPr>
+        <w:t>docs/MACOS_DISTRIBUTION.md</w:t>
+      </w:r>
+      <w:r>
+        <w:rPr>
+          <w:rFonts w:ascii="Calibri" w:hAnsi="Calibri" w:eastAsia="Calibri"/>
+        </w:rPr>
+        <w:t>. Проверка на физическом Intel Mac остаётся рекомендованной; исполнение Python и зависимостей проверяется под Rosetta.</w:t>
       </w:r>
     </w:p>
     <w:p>
@@ -6567,7 +6636,7 @@
         <w:rPr>
           <w:rFonts w:ascii="Calibri" w:hAnsi="Calibri" w:eastAsia="Calibri"/>
         </w:rPr>
-        <w:t>При оценке функций конкурентов следует считать базовыми принципами GZWhisper:</w:t>
+        <w:t>При оценке функций конкурентов следует считать базовыми принципами GZ Whisper Legacy:</w:t>
       </w:r>
     </w:p>
     <w:p>
@@ -6811,7 +6880,24 @@
           <w:color w:val="181D24"/>
           <w:sz w:val="21"/>
         </w:rPr>
-        <w:t>Проведи глубокое исследование рынка десктопных приложений для транскрибации, записи системного аудио/микрофона, локального speech-to-text и управления библиотекой транскриптов. Используй описание GZWhisper в приложенном документе как точный baseline текущего продукта.</w:t>
+        <w:t>Проведи глубокое исследование рынка десктопных приложений для транскрибации, записи системного аудио/микрофона, локального speech-to-</w:t>
+      </w:r>
+      <w:r>
+        <w:rPr>
+          <w:rFonts w:ascii="Menlo" w:hAnsi="Menlo" w:eastAsia="Menlo"/>
+          <w:color w:val="1F4D78"/>
+          <w:sz w:val="20"/>
+          <w:shd w:fill="EDF1F5"/>
+        </w:rPr>
+        <w:t>text</w:t>
+      </w:r>
+      <w:r>
+        <w:rPr>
+          <w:rFonts w:ascii="Calibri" w:hAnsi="Calibri" w:eastAsia="Calibri"/>
+          <w:color w:val="181D24"/>
+          <w:sz w:val="21"/>
+        </w:rPr>
+        <w:t xml:space="preserve"> и управления библиотекой транскриптов. Используй описание GZ Whisper Legacy в приложенном документе как точный baseline прежнего продукта. Разработка новых функций Legacy заморожена; все идеи и roadmap адресуй отдельному новому GZ Whisper для iOS и macOS, не предлагая внедрение новых функций в Legacy.</w:t>
       </w:r>
     </w:p>
     <w:p>
@@ -6879,7 +6965,7 @@
           <w:color w:val="181D24"/>
           <w:sz w:val="21"/>
         </w:rPr>
-        <w:t>4. Не предлагай как «новую» функцию то, что уже реализовано в GZWhisper. Сверяй каждую рекомендацию с baseline.</w:t>
+        <w:t>4. Не предлагай как «новую» функцию то, что уже реализовано в GZ Whisper Legacy. Сверяй каждую рекомендацию с baseline.</w:t>
       </w:r>
     </w:p>
     <w:p>
@@ -6896,7 +6982,7 @@
           <w:color w:val="181D24"/>
           <w:sz w:val="21"/>
         </w:rPr>
-        <w:t>5. Выдели конкретные функции, которые GZWhisper мог бы позаимствовать или переосмыслить. Для каждой укажи: пример конкурента; пользовательскую проблему; ожидаемую ценность; совместимость с local-first; примерный уровень сложности; необходимые архитектурные изменения; риски; потенциал дифференциации; рекомендуемый приоритет.</w:t>
+        <w:t>5. Выдели конкретные функции, которые новый GZ Whisper для iOS и macOS мог бы позаимствовать или переосмыслить. Для каждой укажи: пример конкурента; пользовательскую проблему; ожидаемую ценность; совместимость с local-first; примерный уровень сложности; необходимые архитектурные изменения; риски; потенциал дифференциации; рекомендуемый приоритет.</w:t>
       </w:r>
     </w:p>
     <w:p>
@@ -6930,7 +7016,7 @@
           <w:color w:val="181D24"/>
           <w:sz w:val="21"/>
         </w:rPr>
-        <w:t>7. Отдельно найди функции, которые часто выглядят привлекательно, но плохо совместимы с текущим позиционированием, архитектурой или приватностью GZWhisper.</w:t>
+        <w:t>7. Отдельно найди функции, которые часто выглядят привлекательно, но плохо совместимы с текущим позиционированием, архитектурой или приватностью GZ Whisper Legacy.</w:t>
       </w:r>
     </w:p>
     <w:p>
@@ -6981,7 +7067,7 @@
           <w:color w:val="181D24"/>
           <w:sz w:val="21"/>
         </w:rPr>
-        <w:t>Формат результата: executive summary; карта рынка; сравнительная таблица; gap analysis относительно GZWhisper; каталог заимствуемых паттернов; приоритизированный roadmap; источники. Явно отделяй подтверждённые факты от выводов и предположений.</w:t>
+        <w:t>Формат результата: executive summary; карта рынка; сравнительная таблица; gap analysis относительно GZ Whisper Legacy; каталог заимствуемых паттернов; приоритизированный roadmap; источники. Явно отделяй подтверждённые факты от выводов и предположений.</w:t>
       </w:r>
     </w:p>
     <w:p>
@@ -7002,7 +7088,22 @@
         <w:rPr>
           <w:rFonts w:ascii="Calibri" w:hAnsi="Calibri" w:eastAsia="Calibri"/>
         </w:rPr>
-        <w:t>GZWhisper — local-first desktop-приложение для Apple Silicon и Intel Mac, которое локально транскрибирует аудио и видео через faster-whisper, предлагает каталог моделей с рекомендациями для конкретного Mac и управлением несколькими локальными моделями, записывает системный звук и микрофон в трёх режимах, восстанавливает прерванные записи, управляет последовательной очередью, ведёт полнотекстово ищущую локальную историю и экспортирует результат в TXT/JSON. Продукт не требует аккаунта и не отправляет пользовательское медиа в собственное облако; Linux и Windows portable пока предоставляют более узкий core-сценарий без записи и развитого управления библиотекой.</w:t>
+        <w:t xml:space="preserve">GZ Whisper Legacy — local-first desktop-приложение для Apple Silicon и Intel Mac, которое локально транскрибирует аудио и видео через </w:t>
+      </w:r>
+      <w:r>
+        <w:rPr>
+          <w:rFonts w:ascii="Menlo" w:hAnsi="Menlo" w:eastAsia="Menlo"/>
+          <w:color w:val="1F4D78"/>
+          <w:sz w:val="21"/>
+          <w:shd w:fill="EDF1F5"/>
+        </w:rPr>
+        <w:t>faster-whisper</w:t>
+      </w:r>
+      <w:r>
+        <w:rPr>
+          <w:rFonts w:ascii="Calibri" w:hAnsi="Calibri" w:eastAsia="Calibri"/>
+        </w:rPr>
+        <w:t>, предлагает каталог моделей с рекомендациями для конкретного Mac и управлением несколькими локальными моделями, записывает системный звук и микрофон в трёх режимах, восстанавливает прерванные записи, управляет последовательной очередью, ведёт полнотекстово ищущую локальную историю и экспортирует результат в TXT/JSON. Продукт не требует аккаунта и не отправляет пользовательское медиа в собственное облако; Linux и Windows portable пока предоставляют более узкий core-сценарий без записи и развитого управления библиотекой.</w:t>
       </w:r>
     </w:p>
     <w:p>
@@ -7234,7 +7335,7 @@
         <w:color w:val="5D6875"/>
         <w:sz w:val="18"/>
       </w:rPr>
-      <w:t>v1.5.4 · состояние 23.09.2026</w:t>
+      <w:t>v1.5.5 · состояние 10.10.2026</w:t>
     </w:r>
     <w:r>
       <w:tab/>
@@ -7281,7 +7382,7 @@
         <w:color w:val="5D6875"/>
         <w:sz w:val="18"/>
       </w:rPr>
-      <w:t>GZWhisper</w:t>
+      <w:t>GZ Whisper Legacy</w:t>
     </w:r>
     <w:r>
       <w:tab/>

</xml_diff>